<commit_message>
changes done in the files for "" space break and non text characters
</commit_message>
<xml_diff>
--- a/public/templates/mclerts-template-3.docx
+++ b/public/templates/mclerts-template-3.docx
@@ -2978,11 +2978,7 @@
         <w:t>aintenance</w:t>
       </w:r>
     </w:p>
-    <w:p>
-      <w:r>
-        <w:br w:type="page"/>
-      </w:r>
-    </w:p>
+    <w:p/>
     <w:p>
       <w:pPr>
         <w:rPr>

</xml_diff>